<commit_message>
docs: revisao final dos documentos de submissao a banca
- MVP_CANVAS reescrito com marca Predfy, jornada de 7 etapas, 3 caminhos
  (A/B/C) e referencias ao modo demonstracao offline.
- ENTREGA_TIME1_MODELOS atualizado com Predfy + secao de reprodutibilidade.
- ENTREGA_TIME2_AGENTE atualizado com simulador local, cenarios da Etapa 6
  e pacote ZIP unificado.
- RELATORIO_SOLUCAO v2.0 com cabecalho atualizado.
- .docx regenerados.
</commit_message>
<xml_diff>
--- a/docs/ENTREGA_TIME1_MODELOS.docx
+++ b/docs/ENTREGA_TIME1_MODELOS.docx
@@ -74,6 +74,51 @@
           <w:sz w:val="22"/>
         </w:rPr>
         <w:t xml:space="preserve"> · CESUP-Contratações · Banco do Brasil</w:t>
+      </w:r>
+    </w:p>
+    <w:p>
+      <w:pPr>
+        <w:spacing w:after="80"/>
+      </w:pPr>
+      <w:r>
+        <w:rPr>
+          <w:rFonts w:ascii="Calibri" w:hAnsi="Calibri"/>
+          <w:b/>
+          <w:i w:val="0"/>
+          <w:color w:val="1F1F1F"/>
+          <w:sz w:val="22"/>
+        </w:rPr>
+        <w:t>Produto:</w:t>
+      </w:r>
+      <w:r>
+        <w:rPr>
+          <w:rFonts w:ascii="Calibri" w:hAnsi="Calibri"/>
+          <w:b w:val="0"/>
+          <w:i w:val="0"/>
+          <w:color w:val="1F1F1F"/>
+          <w:sz w:val="22"/>
+        </w:rPr>
+        <w:t xml:space="preserve"> </w:t>
+      </w:r>
+      <w:r>
+        <w:rPr>
+          <w:rFonts w:ascii="Calibri" w:hAnsi="Calibri"/>
+          <w:b/>
+          <w:i w:val="0"/>
+          <w:color w:val="1F1F1F"/>
+          <w:sz w:val="22"/>
+        </w:rPr>
+        <w:t>Predfy</w:t>
+      </w:r>
+      <w:r>
+        <w:rPr>
+          <w:rFonts w:ascii="Calibri" w:hAnsi="Calibri"/>
+          <w:b w:val="0"/>
+          <w:i w:val="0"/>
+          <w:color w:val="1F1F1F"/>
+          <w:sz w:val="22"/>
+        </w:rPr>
+        <w:t xml:space="preserve"> — camada de Modelo Analítico (Etapas 2-3 da jornada)</w:t>
       </w:r>
     </w:p>
     <w:p>
@@ -240,7 +285,7 @@
                 <w:color w:val="1F1F1F"/>
                 <w:sz w:val="20"/>
               </w:rPr>
-              <w:t>Camada</w:t>
+              <w:t>Camada no Predfy</w:t>
             </w:r>
           </w:p>
         </w:tc>
@@ -259,7 +304,7 @@
                 <w:color w:val="1F1F1F"/>
                 <w:sz w:val="20"/>
               </w:rPr>
-              <w:t>Camada Analítica (modelos preditivos + pipeline de dados)</w:t>
+              <w:t>Etapas 0, 2 e 3 da jornada (Dados sintéticos + Treino H2O AutoML + Avaliação)</w:t>
             </w:r>
           </w:p>
         </w:tc>
@@ -375,7 +420,47 @@
                 <w:color w:val="1F1F1F"/>
                 <w:sz w:val="20"/>
               </w:rPr>
-              <w:t>Time 2 (Agente IA + RPA) — schema único de saída JSON dos modelos</w:t>
+              <w:t>Time 2 (Agente Predfy + Intérprete) — schema único de saída JSON dos modelos</w:t>
+            </w:r>
+          </w:p>
+        </w:tc>
+      </w:tr>
+      <w:tr>
+        <w:tc>
+          <w:tcPr>
+            <w:tcW w:type="dxa" w:w="4986"/>
+            <w:shd w:val="clear" w:color="auto" w:fill="F7F8FA"/>
+          </w:tcPr>
+          <w:p>
+            <w:r/>
+            <w:r>
+              <w:rPr>
+                <w:rFonts w:ascii="Calibri" w:hAnsi="Calibri"/>
+                <w:b w:val="0"/>
+                <w:i w:val="0"/>
+                <w:color w:val="1F1F1F"/>
+                <w:sz w:val="20"/>
+              </w:rPr>
+              <w:t>Repositório</w:t>
+            </w:r>
+          </w:p>
+        </w:tc>
+        <w:tc>
+          <w:tcPr>
+            <w:tcW w:type="dxa" w:w="4986"/>
+            <w:shd w:val="clear" w:color="auto" w:fill="F7F8FA"/>
+          </w:tcPr>
+          <w:p>
+            <w:r/>
+            <w:r>
+              <w:rPr>
+                <w:rFonts w:ascii="Calibri" w:hAnsi="Calibri"/>
+                <w:b w:val="0"/>
+                <w:i w:val="0"/>
+                <w:color w:val="1F1F1F"/>
+                <w:sz w:val="20"/>
+              </w:rPr>
+              <w:t>https://github.com/FranMarteen/hypercopa-disec-mvp (público)</w:t>
             </w:r>
           </w:p>
         </w:tc>
@@ -408,7 +493,27 @@
           <w:color w:val="1F1F1F"/>
           <w:sz w:val="22"/>
         </w:rPr>
-        <w:t xml:space="preserve">A camada analítica entrega </w:t>
+        <w:t xml:space="preserve">A camada analítica do </w:t>
+      </w:r>
+      <w:r>
+        <w:rPr>
+          <w:rFonts w:ascii="Calibri" w:hAnsi="Calibri"/>
+          <w:b/>
+          <w:i w:val="0"/>
+          <w:color w:val="1F1F1F"/>
+          <w:sz w:val="22"/>
+        </w:rPr>
+        <w:t>Predfy</w:t>
+      </w:r>
+      <w:r>
+        <w:rPr>
+          <w:rFonts w:ascii="Calibri" w:hAnsi="Calibri"/>
+          <w:b w:val="0"/>
+          <w:i w:val="0"/>
+          <w:color w:val="1F1F1F"/>
+          <w:sz w:val="22"/>
+        </w:rPr>
+        <w:t xml:space="preserve"> entrega </w:t>
       </w:r>
       <w:r>
         <w:rPr>
@@ -469,6 +574,111 @@
           <w:sz w:val="22"/>
         </w:rPr>
         <w:t xml:space="preserve"> após o Estudo de Campo, com 4 protótipos analíticos auxiliares (recorrência, anomalias, HHI, lock-in) preservados como evidência técnica e backlog de evolução.</w:t>
+      </w:r>
+    </w:p>
+    <w:p>
+      <w:pPr>
+        <w:spacing w:after="80"/>
+      </w:pPr>
+      <w:r>
+        <w:rPr>
+          <w:rFonts w:ascii="Calibri" w:hAnsi="Calibri"/>
+          <w:b w:val="0"/>
+          <w:i w:val="0"/>
+          <w:color w:val="1F1F1F"/>
+          <w:sz w:val="22"/>
+        </w:rPr>
+        <w:t xml:space="preserve">A entrega é </w:t>
+      </w:r>
+      <w:r>
+        <w:rPr>
+          <w:rFonts w:ascii="Calibri" w:hAnsi="Calibri"/>
+          <w:b/>
+          <w:i w:val="0"/>
+          <w:color w:val="1F1F1F"/>
+          <w:sz w:val="22"/>
+        </w:rPr>
+        <w:t>reprodutível ponta-a-ponta</w:t>
+      </w:r>
+      <w:r>
+        <w:rPr>
+          <w:rFonts w:ascii="Calibri" w:hAnsi="Calibri"/>
+          <w:b w:val="0"/>
+          <w:i w:val="0"/>
+          <w:color w:val="1F1F1F"/>
+          <w:sz w:val="22"/>
+        </w:rPr>
+        <w:t xml:space="preserve">: </w:t>
+      </w:r>
+      <w:r>
+        <w:rPr>
+          <w:rFonts w:ascii="Consolas" w:hAnsi="Consolas"/>
+          <w:b w:val="0"/>
+          <w:i w:val="0"/>
+          <w:color w:val="1F1F1F"/>
+          <w:sz w:val="22"/>
+        </w:rPr>
+        <w:t>seed=42</w:t>
+      </w:r>
+      <w:r>
+        <w:rPr>
+          <w:rFonts w:ascii="Calibri" w:hAnsi="Calibri"/>
+          <w:b w:val="0"/>
+          <w:i w:val="0"/>
+          <w:color w:val="1F1F1F"/>
+          <w:sz w:val="22"/>
+        </w:rPr>
+        <w:t xml:space="preserve"> em geradores, splits e AutoML; </w:t>
+      </w:r>
+      <w:r>
+        <w:rPr>
+          <w:rFonts w:ascii="Consolas" w:hAnsi="Consolas"/>
+          <w:b w:val="0"/>
+          <w:i w:val="0"/>
+          <w:color w:val="1F1F1F"/>
+          <w:sz w:val="22"/>
+        </w:rPr>
+        <w:t>h2o==3.46.0.6</w:t>
+      </w:r>
+      <w:r>
+        <w:rPr>
+          <w:rFonts w:ascii="Calibri" w:hAnsi="Calibri"/>
+          <w:b w:val="0"/>
+          <w:i w:val="0"/>
+          <w:color w:val="1F1F1F"/>
+          <w:sz w:val="22"/>
+        </w:rPr>
+        <w:t xml:space="preserve"> pinado em </w:t>
+      </w:r>
+      <w:r>
+        <w:rPr>
+          <w:rFonts w:ascii="Consolas" w:hAnsi="Consolas"/>
+          <w:b w:val="0"/>
+          <w:i w:val="0"/>
+          <w:color w:val="1F1F1F"/>
+          <w:sz w:val="22"/>
+        </w:rPr>
+        <w:t>requirements_app.txt</w:t>
+      </w:r>
+      <w:r>
+        <w:rPr>
+          <w:rFonts w:ascii="Calibri" w:hAnsi="Calibri"/>
+          <w:b w:val="0"/>
+          <w:i w:val="0"/>
+          <w:color w:val="1F1F1F"/>
+          <w:sz w:val="22"/>
+        </w:rPr>
+        <w:t xml:space="preserve">; dados sintéticos commitados no repo. </w:t>
+      </w:r>
+      <w:r>
+        <w:rPr>
+          <w:rFonts w:ascii="Calibri" w:hAnsi="Calibri"/>
+          <w:b/>
+          <w:i w:val="0"/>
+          <w:color w:val="1F1F1F"/>
+          <w:sz w:val="22"/>
+        </w:rPr>
+        <w:t>A banca clona, instala e vê os mesmos números que a equipe.</w:t>
       </w:r>
     </w:p>
     <w:p>

</xml_diff>

<commit_message>
docs: Lei 13.303/16 (estatais) + DISUP→DISEC + equipes nominais + visao de producao
- Lei 14.133/21 (Adm. Publica direta) substituida por Lei 13.303/16 (Lei das
  Estatais — correta para o BB) em 16 arquivos.
- DISUP→DISEC em todos os locais.
- MVP_CANVAS atualizado com:
  * Atribuicao: ECOA / CESUP-Contratacoes
  * Equipes nominais (Time 1: Joao23/Francisco/Rosali/Silvia ·
                      Time 2: Bento14/Felipe/Amelia/Vania/Rafael)
  * Visao de producao no fluxo BB
  * Generalizacao via Agente Predfy
  * Nota da chave brinde + Modo demo offline suficiente para banca
- ENTREGA_TIME1, ENTREGA_TIME2 com nomes dos integrantes.
- README com cabecalho atualizado.
- .docx regenerados.
</commit_message>
<xml_diff>
--- a/docs/ENTREGA_TIME1_MODELOS.docx
+++ b/docs/ENTREGA_TIME1_MODELOS.docx
@@ -377,12 +377,22 @@
             <w:r>
               <w:rPr>
                 <w:rFonts w:ascii="Calibri" w:hAnsi="Calibri"/>
+                <w:b/>
+                <w:i w:val="0"/>
+                <w:color w:val="1F1F1F"/>
+                <w:sz w:val="20"/>
+              </w:rPr>
+              <w:t>Time 1 — ECOA / CESUP-Contratações:</w:t>
+            </w:r>
+            <w:r>
+              <w:rPr>
+                <w:rFonts w:ascii="Calibri" w:hAnsi="Calibri"/>
                 <w:b w:val="0"/>
                 <w:i w:val="0"/>
                 <w:color w:val="1F1F1F"/>
                 <w:sz w:val="20"/>
               </w:rPr>
-              <w:t>Equipe HyperCopa DISEC 2026 — Capitão · Bento · João</w:t>
+              <w:t xml:space="preserve"> João 23 (capitão) · Francisco · Rosali · Silvia</w:t>
             </w:r>
           </w:p>
         </w:tc>
@@ -533,7 +543,7 @@
           <w:color w:val="1F1F1F"/>
           <w:sz w:val="22"/>
         </w:rPr>
-        <w:t xml:space="preserve"> sobre dados sintéticos de Licitação Eletrônica (Lei 14.133/21), com schema JSON padronizado consumível pelo Time 2. O escopo de </w:t>
+        <w:t xml:space="preserve"> sobre dados sintéticos de Licitação Eletrônica (Lei 13.303/16), com schema JSON padronizado consumível pelo Time 2. O escopo de </w:t>
       </w:r>
       <w:r>
         <w:rPr>
@@ -3151,7 +3161,7 @@
           <w:color w:val="1F1F1F"/>
           <w:sz w:val="22"/>
         </w:rPr>
-        <w:t xml:space="preserve"> Risco "Dados não disponíveis no prazo" da proposta (Tabela 10) materializou-se. Mitigação aplicada: geradores sintéticos com regras Lei 14.133/21 e ciclo pós-contrato (aditivos, rescisão, atrasos).</w:t>
+        <w:t xml:space="preserve"> Risco "Dados não disponíveis no prazo" da proposta (Tabela 10) materializou-se. Mitigação aplicada: geradores sintéticos com regras Lei 13.303/16 e ciclo pós-contrato (aditivos, rescisão, atrasos).</w:t>
       </w:r>
     </w:p>
     <w:p>

</xml_diff>